<commit_message>
update word lab 6
</commit_message>
<xml_diff>
--- a/Lab5_PhanDinhHieuThao_2131200020/PhanDinhHieuThao_2131200020_Lab6.docx
+++ b/Lab5_PhanDinhHieuThao_2131200020/PhanDinhHieuThao_2131200020_Lab6.docx
@@ -2,6 +2,22 @@
 <file path=word/document.xml><?xml version="1.0" encoding="utf-8"?>
 <w:document xmlns:wpc="http://schemas.microsoft.com/office/word/2010/wordprocessingCanvas" xmlns:mc="http://schemas.openxmlformats.org/markup-compatibility/2006" xmlns:o="urn:schemas-microsoft-com:office:office" xmlns:r="http://schemas.openxmlformats.org/officeDocument/2006/relationships" xmlns:m="http://schemas.openxmlformats.org/officeDocument/2006/math" xmlns:v="urn:schemas-microsoft-com:vml" xmlns:wp14="http://schemas.microsoft.com/office/word/2010/wordprocessingDrawing" xmlns:wp="http://schemas.openxmlformats.org/drawingml/2006/wordprocessingDrawing" xmlns:w="http://schemas.openxmlformats.org/wordprocessingml/2006/main" xmlns:w14="http://schemas.microsoft.com/office/word/2010/wordml" xmlns:w10="urn:schemas-microsoft-com:office:word" xmlns:w15="http://schemas.microsoft.com/office/word/2012/wordml" xmlns:wpg="http://schemas.microsoft.com/office/word/2010/wordprocessingGroup" xmlns:wpi="http://schemas.microsoft.com/office/word/2010/wordprocessingInk" xmlns:wne="http://schemas.microsoft.com/office/word/2006/wordml" xmlns:wps="http://schemas.microsoft.com/office/word/2010/wordprocessingShape" xmlns:wpsCustomData="http://www.wps.cn/officeDocument/2013/wpsCustomData" mc:Ignorable="w14 w15 wp14">
   <w:body>
+    <w:p>
+      <w:r>
+        <w:rPr>
+          <w:rFonts w:hint="default"/>
+        </w:rPr>
+        <w:t>https://github.com/Hieuthao63d/CSE441_Mobile/tree/main/Lab5_PhanDinhHi</w:t>
+      </w:r>
+      <w:bookmarkStart w:id="0" w:name="_GoBack"/>
+      <w:bookmarkEnd w:id="0"/>
+      <w:r>
+        <w:rPr>
+          <w:rFonts w:hint="default"/>
+        </w:rPr>
+        <w:t>euThao_2131200020</w:t>
+      </w:r>
+    </w:p>
     <w:p>
       <w:r>
         <w:drawing>
@@ -240,7 +256,6 @@
     </w:p>
     <w:p/>
     <w:p>
-      <w:bookmarkStart w:id="0" w:name="_GoBack"/>
       <w:r>
         <w:drawing>
           <wp:inline distT="0" distB="0" distL="114300" distR="114300">
@@ -284,7 +299,6 @@
           </wp:inline>
         </w:drawing>
       </w:r>
-      <w:bookmarkEnd w:id="0"/>
     </w:p>
     <w:sectPr>
       <w:pgSz w:w="11906" w:h="16838"/>

</xml_diff>